<commit_message>
Update report with screenshots and repository link
</commit_message>
<xml_diff>
--- a/docs/Отчет_Павлов_ИД_1483-05_Банковские_транзакции.docx
+++ b/docs/Отчет_Павлов_ИД_1483-05_Банковские_транзакции.docx
@@ -748,12 +748,126 @@
       </w:r>
     </w:p>
     <w:p>
+      <w:r/>
       <w:r>
         <w:rPr>
-          <w:rFonts w:ascii="Times New Roman" w:hAnsi="Times New Roman" w:eastAsia="Times New Roman"/>
-          <w:b w:val="0"/>
+          <w:rFonts w:ascii="Times New Roman" w:hAnsi="Times New Roman"/>
+          <w:sz w:val="24"/>
         </w:rPr>
-        <w:t>Ссылка на GitHub репозиторий: указывается после публикации проекта.</w:t>
+        <w:t>Ссылка на GitHub репозиторий: https://github.com/w4ldf1/banktransastions</w:t>
+      </w:r>
+    </w:p>
+    <w:p>
+      <w:r>
+        <w:rPr>
+          <w:rFonts w:ascii="Times New Roman" w:hAnsi="Times New Roman"/>
+          <w:sz w:val="24"/>
+        </w:rPr>
+        <w:t>На рисунках ниже показан опубликованный GitHub-репозиторий проекта и наличие двух веток main и develop, что соответствует требованию задания.</w:t>
+      </w:r>
+    </w:p>
+    <w:p>
+      <w:pPr>
+        <w:jc w:val="center"/>
+      </w:pPr>
+      <w:r>
+        <w:drawing>
+          <wp:inline xmlns:a="http://schemas.openxmlformats.org/drawingml/2006/main" xmlns:pic="http://schemas.openxmlformats.org/drawingml/2006/picture">
+            <wp:extent cx="5989320" cy="3458715"/>
+            <wp:docPr id="8" name="Picture 8"/>
+            <wp:cNvGraphicFramePr>
+              <a:graphicFrameLocks noChangeAspect="1"/>
+            </wp:cNvGraphicFramePr>
+            <a:graphic>
+              <a:graphicData uri="http://schemas.openxmlformats.org/drawingml/2006/picture">
+                <pic:pic>
+                  <pic:nvPicPr>
+                    <pic:cNvPr id="0" name="codex-clipboard-2b9b0d9a-da6b-4d09-97d9-fa4c2343beff.png"/>
+                    <pic:cNvPicPr/>
+                  </pic:nvPicPr>
+                  <pic:blipFill>
+                    <a:blip r:embed="rId16"/>
+                    <a:stretch>
+                      <a:fillRect/>
+                    </a:stretch>
+                  </pic:blipFill>
+                  <pic:spPr>
+                    <a:xfrm>
+                      <a:off x="0" y="0"/>
+                      <a:ext cx="5989320" cy="3458715"/>
+                    </a:xfrm>
+                    <a:prstGeom prst="rect"/>
+                  </pic:spPr>
+                </pic:pic>
+              </a:graphicData>
+            </a:graphic>
+          </wp:inline>
+        </w:drawing>
+      </w:r>
+    </w:p>
+    <w:p>
+      <w:pPr>
+        <w:jc w:val="center"/>
+      </w:pPr>
+      <w:r>
+        <w:rPr>
+          <w:rFonts w:ascii="Times New Roman" w:hAnsi="Times New Roman"/>
+          <w:i/>
+          <w:sz w:val="22"/>
+        </w:rPr>
+        <w:t>Рис 8. GitHub репозиторий проекта</w:t>
+      </w:r>
+    </w:p>
+    <w:p>
+      <w:pPr>
+        <w:jc w:val="center"/>
+      </w:pPr>
+      <w:r>
+        <w:drawing>
+          <wp:inline xmlns:a="http://schemas.openxmlformats.org/drawingml/2006/main" xmlns:pic="http://schemas.openxmlformats.org/drawingml/2006/picture">
+            <wp:extent cx="5989320" cy="2779981"/>
+            <wp:docPr id="9" name="Picture 9"/>
+            <wp:cNvGraphicFramePr>
+              <a:graphicFrameLocks noChangeAspect="1"/>
+            </wp:cNvGraphicFramePr>
+            <a:graphic>
+              <a:graphicData uri="http://schemas.openxmlformats.org/drawingml/2006/picture">
+                <pic:pic>
+                  <pic:nvPicPr>
+                    <pic:cNvPr id="0" name="codex-clipboard-02ab936d-cba8-4023-ab81-29a6a68ee195.png"/>
+                    <pic:cNvPicPr/>
+                  </pic:nvPicPr>
+                  <pic:blipFill>
+                    <a:blip r:embed="rId17"/>
+                    <a:stretch>
+                      <a:fillRect/>
+                    </a:stretch>
+                  </pic:blipFill>
+                  <pic:spPr>
+                    <a:xfrm>
+                      <a:off x="0" y="0"/>
+                      <a:ext cx="5989320" cy="2779981"/>
+                    </a:xfrm>
+                    <a:prstGeom prst="rect"/>
+                  </pic:spPr>
+                </pic:pic>
+              </a:graphicData>
+            </a:graphic>
+          </wp:inline>
+        </w:drawing>
+      </w:r>
+    </w:p>
+    <w:p>
+      <w:pPr>
+        <w:jc w:val="center"/>
+      </w:pPr>
+      <w:r>
+        <w:rPr>
+          <w:rFonts w:ascii="Times New Roman" w:hAnsi="Times New Roman"/>
+          <w:i/>
+          <w:sz w:val="22"/>
+        </w:rPr>
+        <w:t>Рис 9. Ветки main и develop в GitHub-репозитории</w:t>
       </w:r>
     </w:p>
     <w:p>
@@ -1827,6 +1941,67 @@
       </w:r>
     </w:p>
     <w:p>
+      <w:r>
+        <w:rPr>
+          <w:rFonts w:ascii="Times New Roman" w:hAnsi="Times New Roman"/>
+          <w:sz w:val="24"/>
+        </w:rPr>
+        <w:t>После запуска серверной части оконный клиент подключается к http://localhost:5055 и позволяет работать с клиентами, счетами, транзакциями и банками-партнерами.</w:t>
+      </w:r>
+    </w:p>
+    <w:p>
+      <w:pPr>
+        <w:jc w:val="center"/>
+      </w:pPr>
+      <w:r>
+        <w:drawing>
+          <wp:inline xmlns:a="http://schemas.openxmlformats.org/drawingml/2006/main" xmlns:pic="http://schemas.openxmlformats.org/drawingml/2006/picture">
+            <wp:extent cx="5989320" cy="3997947"/>
+            <wp:docPr id="10" name="Picture 10"/>
+            <wp:cNvGraphicFramePr>
+              <a:graphicFrameLocks noChangeAspect="1"/>
+            </wp:cNvGraphicFramePr>
+            <a:graphic>
+              <a:graphicData uri="http://schemas.openxmlformats.org/drawingml/2006/picture">
+                <pic:pic>
+                  <pic:nvPicPr>
+                    <pic:cNvPr id="0" name="codex-clipboard-ebcf4da0-80ae-4fad-8860-2cb5eba04b26.png"/>
+                    <pic:cNvPicPr/>
+                  </pic:nvPicPr>
+                  <pic:blipFill>
+                    <a:blip r:embed="rId18"/>
+                    <a:stretch>
+                      <a:fillRect/>
+                    </a:stretch>
+                  </pic:blipFill>
+                  <pic:spPr>
+                    <a:xfrm>
+                      <a:off x="0" y="0"/>
+                      <a:ext cx="5989320" cy="3997947"/>
+                    </a:xfrm>
+                    <a:prstGeom prst="rect"/>
+                  </pic:spPr>
+                </pic:pic>
+              </a:graphicData>
+            </a:graphic>
+          </wp:inline>
+        </w:drawing>
+      </w:r>
+    </w:p>
+    <w:p>
+      <w:pPr>
+        <w:jc w:val="center"/>
+      </w:pPr>
+      <w:r>
+        <w:rPr>
+          <w:rFonts w:ascii="Times New Roman" w:hAnsi="Times New Roman"/>
+          <w:i/>
+          <w:sz w:val="22"/>
+        </w:rPr>
+        <w:t>Рис 10. Работа оконного приложения</w:t>
+      </w:r>
+    </w:p>
+    <w:p>
       <w:pPr>
         <w:pStyle w:val="Heading1"/>
       </w:pPr>

</xml_diff>